<commit_message>
Agrega instrucciones para clonar el repo del taller y un README raiz
El Modulo 0 ahora incluye una seccion (0.2) para clonar taller-2-kedro
como forma oficial de obtener el material de referencia, en vez de
asumir que los archivos llegan sueltos. Se renumeraron las secciones
siguientes del Modulo 0 y se agrego un README.md en la raiz del repo
para que tenga sentido al aterrizar ahi desde GitHub.
</commit_message>
<xml_diff>
--- a/material_taller/Taller_Kedro_Completo.docx
+++ b/material_taller/Taller_Kedro_Completo.docx
@@ -231,7 +231,7 @@
               <w:rPr>
                 <w:sz w:val="21"/>
               </w:rPr>
-              <w:t>Entorno virtual con Kedro y Kedro-Viz instalados y verificados</w:t>
+              <w:t>Repositorio del taller clonado, entorno virtual con Kedro y Kedro-Viz instalados</w:t>
             </w:r>
           </w:p>
         </w:tc>
@@ -250,7 +250,7 @@
               <w:rPr>
                 <w:sz w:val="21"/>
               </w:rPr>
-              <w:t>30 min</w:t>
+              <w:t>35 min</w:t>
             </w:r>
           </w:p>
         </w:tc>
@@ -503,7 +503,7 @@
     </w:p>
     <w:p>
       <w:r>
-        <w:t>Igual que en el Taller 1: cada módulo abre con lo que necesitas antes de empezar, avanza en secciones numeradas con pasos concretos, incluye un ejercicio práctico, y cierra con una tabla de troubleshooting y una sección opcional "para profundizar". Los bloques de código son para escribir tú mismo, no para copiar y pegar — la carpeta material_taller/modulo_X tiene versiones de referencia para comparar.</w:t>
+        <w:t>Igual que en el Taller 1: cada módulo abre con lo que necesitas antes de empezar, avanza en secciones numeradas con pasos concretos, incluye un ejercicio práctico, y cierra con una tabla de troubleshooting y una sección opcional "para profundizar". Los bloques de código son para escribir tú mismo, no para copiar y pegar — la carpeta material_taller/modulo_X del repositorio taller-2-kedro (sección 0.2) tiene versiones de referencia para comparar.</w:t>
       </w:r>
     </w:p>
     <w:p>
@@ -934,7 +934,7 @@
     </w:p>
     <w:p>
       <w:r>
-        <w:t>Necesitas haber completado el Módulo 0 y el Módulo 1 del Taller 1: Python 3.10 o superior instalado, VSCode con la extensión de Python, y haber creado al menos un entorno virtual antes. Si algo de eso no te suena, vuelve al Taller 1 antes de continuar — esta guía no lo vuelve a explicar.</w:t>
+        <w:t>Necesitas haber completado el Módulo 0 y el Módulo 1 del Taller 1: Python 3.10 o superior instalado, VSCode con la extensión de Python, Git configurado, y haber creado al menos un entorno virtual antes. Si algo de eso no te suena, vuelve al Taller 1 antes de continuar — esta guía no lo vuelve a explicar.</w:t>
       </w:r>
     </w:p>
     <w:p>
@@ -958,6 +958,14 @@
         <w:pStyle w:val="ListBullet"/>
       </w:pPr>
       <w:r>
+        <w:t>Git instalado y funcionando (verifica con git --version) — lo usaste en el Módulo 3 del Taller 1</w:t>
+      </w:r>
+    </w:p>
+    <w:p>
+      <w:pPr>
+        <w:pStyle w:val="ListBullet"/>
+      </w:pPr>
+      <w:r>
         <w:t>Al menos 2 GB libres en disco para datos y dependencias</w:t>
       </w:r>
     </w:p>
@@ -966,7 +974,7 @@
         <w:pStyle w:val="ListBullet"/>
       </w:pPr>
       <w:r>
-        <w:t>Conexión a internet para instalar paquetes</w:t>
+        <w:t>Conexión a internet para instalar paquetes y clonar el repositorio</w:t>
       </w:r>
     </w:p>
     <w:p>
@@ -974,12 +982,12 @@
         <w:pStyle w:val="Heading2"/>
       </w:pPr>
       <w:r>
-        <w:t>0.2 Crear un entorno virtual nuevo para este taller</w:t>
+        <w:t>0.2 Clonar el repositorio del taller</w:t>
       </w:r>
     </w:p>
     <w:p>
       <w:r>
-        <w:t>Usa un entorno virtual distinto al del Taller 1 — Kedro trae sus propias dependencias (pandas, scikit-learn, PyYAML, entre otras) y mezclar proyectos en el mismo entorno tarde o temprano genera conflictos de versiones. Crea la carpeta en una ruta corta — por ejemplo C:\kedro\ — en vez de dentro de tu OneDrive o de carpetas ya muy anidadas del Taller 1.</w:t>
+        <w:t>Todo el material de referencia que esta guía menciona (material_taller/modulo_1 a modulo_4) vive en un repositorio de GitHub, junto con esta misma guía en formato Word. En vez de que te pasen los archivos sueltos, lo vas a clonar — así también practicas el flujo de Git que aprendiste en el Taller 1, ahora del lado de "bajar" un repo en vez de "subir" uno.</w:t>
       </w:r>
     </w:p>
     <w:tbl>
@@ -1056,9 +1064,162 @@
                 <w:rFonts w:ascii="Consolas" w:hAnsi="Consolas"/>
                 <w:sz w:val="20"/>
               </w:rPr>
-              <w:t>mkdir taller-kedro</w:t>
-            </w:r>
-          </w:p>
+              <w:t>git clone https://github.com/yacastanot/taller-2-kedro.git</w:t>
+            </w:r>
+          </w:p>
+        </w:tc>
+      </w:tr>
+    </w:tbl>
+    <w:p/>
+    <w:p>
+      <w:r>
+        <w:t>Esto crea C:\kedro\taller-2-kedro\ con material_taller/ adentro. Ábrela en VSCode (File &gt; Open Folder) y déjala como referencia de consulta — vas a volver a ella cada vez que la guía apunte a un archivo de modulo_X.</w:t>
+      </w:r>
+    </w:p>
+    <w:tbl>
+      <w:tblPr>
+        <w:tblW w:type="auto" w:w="0"/>
+        <w:tblLayout w:type="fixed"/>
+        <w:tblLook w:firstColumn="1" w:firstRow="1" w:lastColumn="0" w:lastRow="0" w:noHBand="0" w:noVBand="1" w:val="04A0"/>
+        <w:tblBorders>
+          <w:top w:val="single" w:sz="4" w:space="0" w:color="B7B7B7"/>
+          <w:bottom w:val="single" w:sz="4" w:space="0" w:color="B7B7B7"/>
+          <w:right w:val="single" w:sz="4" w:space="0" w:color="B7B7B7"/>
+          <w:left w:val="single" w:sz="24" w:space="0" w:color="C55A11"/>
+          <w:insideH w:val="single" w:sz="4" w:space="0" w:color="auto"/>
+          <w:insideV w:val="single" w:sz="4" w:space="0" w:color="auto"/>
+        </w:tblBorders>
+      </w:tblPr>
+      <w:tblGrid>
+        <w:gridCol w:w="9360"/>
+      </w:tblGrid>
+      <w:tr>
+        <w:tc>
+          <w:tcPr>
+            <w:tcW w:type="dxa" w:w="9360"/>
+            <w:shd w:val="clear" w:color="auto" w:fill="FCE4D6"/>
+            <w:tcMar>
+              <w:top w:w="80" w:type="dxa"/>
+              <w:bottom w:w="80" w:type="dxa"/>
+              <w:left w:w="160" w:type="dxa"/>
+              <w:right w:w="140" w:type="dxa"/>
+            </w:tcMar>
+          </w:tcPr>
+          <w:p>
+            <w:r>
+              <w:rPr>
+                <w:b/>
+                <w:color w:val="C55A11"/>
+                <w:sz w:val="21"/>
+              </w:rPr>
+              <w:t>⚠ Atención</w:t>
+            </w:r>
+          </w:p>
+          <w:p>
+            <w:r>
+              <w:rPr>
+                <w:sz w:val="21"/>
+              </w:rPr>
+              <w:t>taller-2-kedro/ es un repositorio de solo lectura para ti — es el material del taller, no tu entrega. Tu propio proyecto Kedro (el que vas a crear en la sección 0.3 y hacer crecer en los Módulos 1 a 4) va en una carpeta hermana, separada, con su propio repositorio nuevo. No trabajes dentro de taller-2-kedro/ ni intentes hacerle push — no es tu repo.</w:t>
+            </w:r>
+          </w:p>
+        </w:tc>
+      </w:tr>
+    </w:tbl>
+    <w:p/>
+    <w:tbl>
+      <w:tblPr>
+        <w:tblW w:type="auto" w:w="0"/>
+        <w:tblLayout w:type="fixed"/>
+        <w:tblLook w:firstColumn="1" w:firstRow="1" w:lastColumn="0" w:lastRow="0" w:noHBand="0" w:noVBand="1" w:val="04A0"/>
+        <w:tblBorders>
+          <w:top w:val="single" w:sz="4" w:space="0" w:color="B7B7B7"/>
+          <w:bottom w:val="single" w:sz="4" w:space="0" w:color="B7B7B7"/>
+          <w:right w:val="single" w:sz="4" w:space="0" w:color="B7B7B7"/>
+          <w:left w:val="single" w:sz="24" w:space="0" w:color="2E75B6"/>
+          <w:insideH w:val="single" w:sz="4" w:space="0" w:color="auto"/>
+          <w:insideV w:val="single" w:sz="4" w:space="0" w:color="auto"/>
+        </w:tblBorders>
+      </w:tblPr>
+      <w:tblGrid>
+        <w:gridCol w:w="9360"/>
+      </w:tblGrid>
+      <w:tr>
+        <w:tc>
+          <w:tcPr>
+            <w:tcW w:type="dxa" w:w="9360"/>
+            <w:shd w:val="clear" w:color="auto" w:fill="D9E2F3"/>
+            <w:tcMar>
+              <w:top w:w="80" w:type="dxa"/>
+              <w:bottom w:w="80" w:type="dxa"/>
+              <w:left w:w="160" w:type="dxa"/>
+              <w:right w:w="140" w:type="dxa"/>
+            </w:tcMar>
+          </w:tcPr>
+          <w:p>
+            <w:r>
+              <w:rPr>
+                <w:b/>
+                <w:color w:val="2E75B6"/>
+                <w:sz w:val="21"/>
+              </w:rPr>
+              <w:t>✅ Checkpoint</w:t>
+            </w:r>
+          </w:p>
+          <w:p>
+            <w:r>
+              <w:rPr>
+                <w:sz w:val="21"/>
+              </w:rPr>
+              <w:t>C:\kedro\taller-2-kedro\material_taller\modulo_1\README.md existe y lo puedes abrir. Si git clone falló, confirma que Git sigue instalado (git --version) y que tienes conexión a internet.</w:t>
+            </w:r>
+          </w:p>
+        </w:tc>
+      </w:tr>
+    </w:tbl>
+    <w:p/>
+    <w:p>
+      <w:pPr>
+        <w:pStyle w:val="Heading2"/>
+      </w:pPr>
+      <w:r>
+        <w:t>0.3 Crear un entorno virtual nuevo para este taller</w:t>
+      </w:r>
+    </w:p>
+    <w:p>
+      <w:r>
+        <w:t>Usa un entorno virtual distinto al del Taller 1 — Kedro trae sus propias dependencias (pandas, scikit-learn, PyYAML, entre otras) y mezclar proyectos en el mismo entorno tarde o temprano genera conflictos de versiones. Créalo como carpeta hermana del repositorio que acabas de clonar, no adentro de él:</w:t>
+      </w:r>
+    </w:p>
+    <w:tbl>
+      <w:tblPr>
+        <w:tblW w:type="auto" w:w="0"/>
+        <w:tblLayout w:type="fixed"/>
+        <w:tblLook w:firstColumn="1" w:firstRow="1" w:lastColumn="0" w:lastRow="0" w:noHBand="0" w:noVBand="1" w:val="04A0"/>
+        <w:tblBorders>
+          <w:top w:val="single" w:sz="4" w:space="0" w:color="B7B7B7"/>
+          <w:left w:val="single" w:sz="4" w:space="0" w:color="B7B7B7"/>
+          <w:bottom w:val="single" w:sz="4" w:space="0" w:color="B7B7B7"/>
+          <w:right w:val="single" w:sz="4" w:space="0" w:color="B7B7B7"/>
+          <w:insideH w:val="single" w:sz="4" w:space="0" w:color="auto"/>
+          <w:insideV w:val="single" w:sz="4" w:space="0" w:color="auto"/>
+        </w:tblBorders>
+      </w:tblPr>
+      <w:tblGrid>
+        <w:gridCol w:w="9360"/>
+      </w:tblGrid>
+      <w:tr>
+        <w:tc>
+          <w:tcPr>
+            <w:tcW w:type="dxa" w:w="9360"/>
+            <w:shd w:val="clear" w:color="auto" w:fill="F2F2F2"/>
+            <w:tcMar>
+              <w:top w:w="60" w:type="dxa"/>
+              <w:bottom w:w="60" w:type="dxa"/>
+              <w:left w:w="100" w:type="dxa"/>
+              <w:right w:w="100" w:type="dxa"/>
+            </w:tcMar>
+          </w:tcPr>
           <w:p>
             <w:pPr>
               <w:spacing w:before="0" w:after="0" w:line="240" w:lineRule="auto"/>
@@ -1068,7 +1229,7 @@
                 <w:rFonts w:ascii="Consolas" w:hAnsi="Consolas"/>
                 <w:sz w:val="20"/>
               </w:rPr>
-              <w:t>cd taller-kedro</w:t>
+              <w:t>cd C:\kedro</w:t>
             </w:r>
           </w:p>
           <w:p>
@@ -1080,7 +1241,7 @@
                 <w:rFonts w:ascii="Consolas" w:hAnsi="Consolas"/>
                 <w:sz w:val="20"/>
               </w:rPr>
-              <w:t>python -m venv .venv</w:t>
+              <w:t>mkdir taller-kedro</w:t>
             </w:r>
           </w:p>
           <w:p>
@@ -1092,7 +1253,87 @@
                 <w:rFonts w:ascii="Consolas" w:hAnsi="Consolas"/>
                 <w:sz w:val="20"/>
               </w:rPr>
+              <w:t>cd taller-kedro</w:t>
+            </w:r>
+          </w:p>
+          <w:p>
+            <w:pPr>
+              <w:spacing w:before="0" w:after="0" w:line="240" w:lineRule="auto"/>
+            </w:pPr>
+            <w:r>
+              <w:rPr>
+                <w:rFonts w:ascii="Consolas" w:hAnsi="Consolas"/>
+                <w:sz w:val="20"/>
+              </w:rPr>
+              <w:t>python -m venv .venv</w:t>
+            </w:r>
+          </w:p>
+          <w:p>
+            <w:pPr>
+              <w:spacing w:before="0" w:after="0" w:line="240" w:lineRule="auto"/>
+            </w:pPr>
+            <w:r>
+              <w:rPr>
+                <w:rFonts w:ascii="Consolas" w:hAnsi="Consolas"/>
+                <w:sz w:val="20"/>
+              </w:rPr>
               <w:t>.venv\Scripts\activate</w:t>
+            </w:r>
+          </w:p>
+        </w:tc>
+      </w:tr>
+    </w:tbl>
+    <w:p/>
+    <w:p>
+      <w:r>
+        <w:t>Al final de este paso deberías tener C:\kedro\taller-2-kedro\ (el material clonado, de solo lectura) y C:\kedro\taller-kedro\ (tu propio trabajo) como carpetas hermanas dentro de C:\kedro\.</w:t>
+      </w:r>
+    </w:p>
+    <w:tbl>
+      <w:tblPr>
+        <w:tblW w:type="auto" w:w="0"/>
+        <w:tblLayout w:type="fixed"/>
+        <w:tblLook w:firstColumn="1" w:firstRow="1" w:lastColumn="0" w:lastRow="0" w:noHBand="0" w:noVBand="1" w:val="04A0"/>
+        <w:tblBorders>
+          <w:top w:val="single" w:sz="4" w:space="0" w:color="B7B7B7"/>
+          <w:bottom w:val="single" w:sz="4" w:space="0" w:color="B7B7B7"/>
+          <w:right w:val="single" w:sz="4" w:space="0" w:color="B7B7B7"/>
+          <w:left w:val="single" w:sz="24" w:space="0" w:color="C55A11"/>
+          <w:insideH w:val="single" w:sz="4" w:space="0" w:color="auto"/>
+          <w:insideV w:val="single" w:sz="4" w:space="0" w:color="auto"/>
+        </w:tblBorders>
+      </w:tblPr>
+      <w:tblGrid>
+        <w:gridCol w:w="9360"/>
+      </w:tblGrid>
+      <w:tr>
+        <w:tc>
+          <w:tcPr>
+            <w:tcW w:type="dxa" w:w="9360"/>
+            <w:shd w:val="clear" w:color="auto" w:fill="FCE4D6"/>
+            <w:tcMar>
+              <w:top w:w="80" w:type="dxa"/>
+              <w:bottom w:w="80" w:type="dxa"/>
+              <w:left w:w="160" w:type="dxa"/>
+              <w:right w:w="140" w:type="dxa"/>
+            </w:tcMar>
+          </w:tcPr>
+          <w:p>
+            <w:r>
+              <w:rPr>
+                <w:b/>
+                <w:color w:val="C55A11"/>
+                <w:sz w:val="21"/>
+              </w:rPr>
+              <w:t>⚠ Atención</w:t>
+            </w:r>
+          </w:p>
+          <w:p>
+            <w:r>
+              <w:rPr>
+                <w:sz w:val="21"/>
+              </w:rPr>
+              <w:t>No reactives ni reutilices el .venv del Taller 1 para este taller. Kedro instala sus propias versiones de pandas y otras librerías, y mezclar proyectos en el mismo entorno tarde o temprano genera conflictos de versiones difíciles de diagnosticar.</w:t>
             </w:r>
           </w:p>
         </w:tc>
@@ -1143,58 +1384,7 @@
               <w:rPr>
                 <w:sz w:val="21"/>
               </w:rPr>
-              <w:t>No reactives ni reutilices el .venv del Taller 1 para este taller. Kedro instala sus propias versiones de pandas y otras librerías, y mezclar proyectos en el mismo entorno tarde o temprano genera conflictos de versiones difíciles de diagnosticar.</w:t>
-            </w:r>
-          </w:p>
-        </w:tc>
-      </w:tr>
-    </w:tbl>
-    <w:p/>
-    <w:tbl>
-      <w:tblPr>
-        <w:tblW w:type="auto" w:w="0"/>
-        <w:tblLayout w:type="fixed"/>
-        <w:tblLook w:firstColumn="1" w:firstRow="1" w:lastColumn="0" w:lastRow="0" w:noHBand="0" w:noVBand="1" w:val="04A0"/>
-        <w:tblBorders>
-          <w:top w:val="single" w:sz="4" w:space="0" w:color="B7B7B7"/>
-          <w:bottom w:val="single" w:sz="4" w:space="0" w:color="B7B7B7"/>
-          <w:right w:val="single" w:sz="4" w:space="0" w:color="B7B7B7"/>
-          <w:left w:val="single" w:sz="24" w:space="0" w:color="C55A11"/>
-          <w:insideH w:val="single" w:sz="4" w:space="0" w:color="auto"/>
-          <w:insideV w:val="single" w:sz="4" w:space="0" w:color="auto"/>
-        </w:tblBorders>
-      </w:tblPr>
-      <w:tblGrid>
-        <w:gridCol w:w="9360"/>
-      </w:tblGrid>
-      <w:tr>
-        <w:tc>
-          <w:tcPr>
-            <w:tcW w:type="dxa" w:w="9360"/>
-            <w:shd w:val="clear" w:color="auto" w:fill="FCE4D6"/>
-            <w:tcMar>
-              <w:top w:w="80" w:type="dxa"/>
-              <w:bottom w:w="80" w:type="dxa"/>
-              <w:left w:w="160" w:type="dxa"/>
-              <w:right w:w="140" w:type="dxa"/>
-            </w:tcMar>
-          </w:tcPr>
-          <w:p>
-            <w:r>
-              <w:rPr>
-                <w:b/>
-                <w:color w:val="C55A11"/>
-                <w:sz w:val="21"/>
-              </w:rPr>
-              <w:t>⚠ Atención</w:t>
-            </w:r>
-          </w:p>
-          <w:p>
-            <w:r>
-              <w:rPr>
-                <w:sz w:val="21"/>
-              </w:rPr>
-              <w:t>Windows tiene un límite clásico de 260 caracteres para la ruta completa de un archivo. Una de las dependencias de Kedro (pyarrow) falla al cargar con un error "DLL load failed" cuando el proyecto vive muy adentro de una estructura de carpetas larga — por ejemplo dentro de OneDrive con varios niveles de subcarpetas del Taller 1. Crear el proyecto en una ruta corta desde el inicio evita este problema por completo.</w:t>
+              <w:t>Windows tiene un límite clásico de 260 caracteres para la ruta completa de un archivo. Una de las dependencias de Kedro (pyarrow) falla al cargar con un error "DLL load failed" cuando el proyecto vive muy adentro de una estructura de carpetas larga — por ejemplo dentro de OneDrive con varios niveles de subcarpetas del Taller 1. Crear el proyecto en una ruta corta como C:\kedro\ desde el inicio evita este problema por completo.</w:t>
             </w:r>
           </w:p>
         </w:tc>
@@ -1206,7 +1396,7 @@
         <w:pStyle w:val="Heading2"/>
       </w:pPr>
       <w:r>
-        <w:t>0.3 Instalar Kedro y Kedro-Viz</w:t>
+        <w:t>0.4 Instalar Kedro y Kedro-Viz</w:t>
       </w:r>
     </w:p>
     <w:p>
@@ -1269,7 +1459,7 @@
         <w:pStyle w:val="Heading2"/>
       </w:pPr>
       <w:r>
-        <w:t>0.4 Verificar que todo funciona</w:t>
+        <w:t>0.5 Verificar que todo funciona</w:t>
       </w:r>
     </w:p>
     <w:tbl>
@@ -1366,7 +1556,7 @@
               <w:rPr>
                 <w:sz w:val="21"/>
               </w:rPr>
-              <w:t>kedro info imprime una versión de Kedro y, en la lista de plugins, kedro-viz. Si no ves kedro-viz ahí, no sigas al Módulo 1 — vuelve a la sección 0.3 y reinstálalo con el entorno correcto activado.</w:t>
+              <w:t>kedro info imprime una versión de Kedro y, en la lista de plugins, kedro-viz. Si no ves kedro-viz ahí, no sigas al Módulo 1 — vuelve a la sección 0.4 y reinstálalo con el entorno correcto activado.</w:t>
             </w:r>
           </w:p>
         </w:tc>
@@ -1378,7 +1568,7 @@
         <w:pStyle w:val="Heading2"/>
       </w:pPr>
       <w:r>
-        <w:t>0.5 Glosario rápido: de SAS/R/Excel al vocabulario de Kedro</w:t>
+        <w:t>0.6 Glosario rápido: de SAS/R/Excel al vocabulario de Kedro</w:t>
       </w:r>
     </w:p>
     <w:tbl>
@@ -1703,7 +1893,7 @@
         <w:pStyle w:val="Heading2"/>
       </w:pPr>
       <w:r>
-        <w:t>0.6 Troubleshooting del Módulo 0</w:t>
+        <w:t>0.7 Troubleshooting del Módulo 0</w:t>
       </w:r>
     </w:p>
     <w:tbl>
@@ -1809,6 +1999,124 @@
               <w:rPr>
                 <w:sz w:val="21"/>
               </w:rPr>
+              <w:t>git clone falla con "git no se reconoce como comando"</w:t>
+            </w:r>
+          </w:p>
+        </w:tc>
+        <w:tc>
+          <w:tcPr>
+            <w:tcW w:type="dxa" w:w="2880"/>
+            <w:tcMar>
+              <w:top w:w="60" w:type="dxa"/>
+              <w:bottom w:w="60" w:type="dxa"/>
+              <w:left w:w="100" w:type="dxa"/>
+              <w:right w:w="100" w:type="dxa"/>
+            </w:tcMar>
+          </w:tcPr>
+          <w:p>
+            <w:r>
+              <w:rPr>
+                <w:sz w:val="21"/>
+              </w:rPr>
+              <w:t>Git no está instalado o no quedó en el PATH</w:t>
+            </w:r>
+          </w:p>
+        </w:tc>
+        <w:tc>
+          <w:tcPr>
+            <w:tcW w:type="dxa" w:w="2880"/>
+            <w:tcMar>
+              <w:top w:w="60" w:type="dxa"/>
+              <w:bottom w:w="60" w:type="dxa"/>
+              <w:left w:w="100" w:type="dxa"/>
+              <w:right w:w="100" w:type="dxa"/>
+            </w:tcMar>
+          </w:tcPr>
+          <w:p>
+            <w:r>
+              <w:rPr>
+                <w:sz w:val="21"/>
+              </w:rPr>
+              <w:t>Reinstala Git para Windows (Módulo 3 del Taller 1) y abre una terminal nueva</w:t>
+            </w:r>
+          </w:p>
+        </w:tc>
+      </w:tr>
+      <w:tr>
+        <w:tc>
+          <w:tcPr>
+            <w:tcW w:type="dxa" w:w="2880"/>
+            <w:tcMar>
+              <w:top w:w="60" w:type="dxa"/>
+              <w:bottom w:w="60" w:type="dxa"/>
+              <w:left w:w="100" w:type="dxa"/>
+              <w:right w:w="100" w:type="dxa"/>
+            </w:tcMar>
+          </w:tcPr>
+          <w:p>
+            <w:r>
+              <w:rPr>
+                <w:sz w:val="21"/>
+              </w:rPr>
+              <w:t>git clone falla con "repository not found"</w:t>
+            </w:r>
+          </w:p>
+        </w:tc>
+        <w:tc>
+          <w:tcPr>
+            <w:tcW w:type="dxa" w:w="2880"/>
+            <w:tcMar>
+              <w:top w:w="60" w:type="dxa"/>
+              <w:bottom w:w="60" w:type="dxa"/>
+              <w:left w:w="100" w:type="dxa"/>
+              <w:right w:w="100" w:type="dxa"/>
+            </w:tcMar>
+          </w:tcPr>
+          <w:p>
+            <w:r>
+              <w:rPr>
+                <w:sz w:val="21"/>
+              </w:rPr>
+              <w:t>Escribiste mal la URL, o el repo es privado y no tienes acceso</w:t>
+            </w:r>
+          </w:p>
+        </w:tc>
+        <w:tc>
+          <w:tcPr>
+            <w:tcW w:type="dxa" w:w="2880"/>
+            <w:tcMar>
+              <w:top w:w="60" w:type="dxa"/>
+              <w:bottom w:w="60" w:type="dxa"/>
+              <w:left w:w="100" w:type="dxa"/>
+              <w:right w:w="100" w:type="dxa"/>
+            </w:tcMar>
+          </w:tcPr>
+          <w:p>
+            <w:r>
+              <w:rPr>
+                <w:sz w:val="21"/>
+              </w:rPr>
+              <w:t>Copia la URL exacta https://github.com/yacastanot/taller-2-kedro.git; si sigue fallando, confirma con el instructor que tienes acceso</w:t>
+            </w:r>
+          </w:p>
+        </w:tc>
+      </w:tr>
+      <w:tr>
+        <w:tc>
+          <w:tcPr>
+            <w:tcW w:type="dxa" w:w="2880"/>
+            <w:tcMar>
+              <w:top w:w="60" w:type="dxa"/>
+              <w:bottom w:w="60" w:type="dxa"/>
+              <w:left w:w="100" w:type="dxa"/>
+              <w:right w:w="100" w:type="dxa"/>
+            </w:tcMar>
+          </w:tcPr>
+          <w:p>
+            <w:r>
+              <w:rPr>
+                <w:sz w:val="21"/>
+              </w:rPr>
               <w:t>kedro no se reconoce como comando</w:t>
             </w:r>
           </w:p>
@@ -2054,7 +2362,7 @@
     </w:p>
     <w:p>
       <w:r>
-        <w:t>Haber completado el Módulo 0: entorno virtual activado con kedro y kedro-viz instalados.</w:t>
+        <w:t>Haber completado el Módulo 0: repositorio taller-2-kedro clonado y entorno virtual activado con kedro y kedro-viz instalados.</w:t>
       </w:r>
     </w:p>
     <w:p>

</xml_diff>